<commit_message>
Switch embedding practical to a proper npm-scaffolded Vite/React app
</commit_message>
<xml_diff>
--- a/03-embedding-websites/Practical_8_Handout.docx
+++ b/03-embedding-websites/Practical_8_Handout.docx
@@ -40,7 +40,7 @@
           <w:i w:val="0"/>
           <w:sz w:val="22"/>
         </w:rPr>
-        <w:t>This handout is the hands-on companion to the Embedding Products into Websites session. You will choose a product, add it to a training web page, and check that it works on a small screen.</w:t>
+        <w:t>This handout is the hands-on companion to the Embedding Products into Websites session. You will run a small starter app, choose a product, add it to the page, and check that it works on a small screen.</w:t>
       </w:r>
     </w:p>
     <w:p>
@@ -50,7 +50,7 @@
           <w:i w:val="0"/>
           <w:sz w:val="22"/>
         </w:rPr>
-        <w:t>Work individually or in pairs - this is a short, focused exercise.</w:t>
+        <w:t>Work individually or in pairs - this is a short, focused exercise. You do not need to understand how the app works under the hood - just follow the steps.</w:t>
       </w:r>
     </w:p>
     <w:p>
@@ -68,7 +68,7 @@
         <w:pStyle w:val="ListBullet"/>
       </w:pPr>
       <w:r>
-        <w:t>training_page_template.html - your starting page, with a marked spot to add your embed</w:t>
+        <w:t>A terminal and a text editor (both built into your Codespace, or use your own if working locally)</w:t>
       </w:r>
     </w:p>
     <w:p>
@@ -76,7 +76,7 @@
         <w:pStyle w:val="ListBullet"/>
       </w:pPr>
       <w:r>
-        <w:t>embed_examples.html - three ready-made embed options to choose from</w:t>
+        <w:t>Node.js and npm - already installed in the Codespace</w:t>
       </w:r>
     </w:p>
     <w:p>
@@ -84,7 +84,7 @@
         <w:pStyle w:val="ListBullet"/>
       </w:pPr>
       <w:r>
-        <w:t>A web browser and a text editor (Notepad, VS Code, or similar)</w:t>
+        <w:t>The files in this folder: package.json, index.html, and the src/ folder</w:t>
       </w:r>
     </w:p>
     <w:p>
@@ -99,7 +99,7 @@
           <w:color w:val="02C39A"/>
           <w:sz w:val="30"/>
         </w:rPr>
-        <w:t>Part A — Choose Your Product  (5 min)</w:t>
+        <w:t>Part A — Get the App Running  (10 min)</w:t>
       </w:r>
     </w:p>
     <w:p>
@@ -109,7 +109,74 @@
           <w:i w:val="0"/>
           <w:sz w:val="22"/>
         </w:rPr>
-        <w:t>Decide which type of product you want to embed:</w:t>
+        <w:t>In the terminal, inside this folder, run these two commands:</w:t>
+      </w:r>
+    </w:p>
+    <w:p>
+      <w:pPr>
+        <w:ind w:left="432"/>
+      </w:pPr>
+      <w:r>
+        <w:rPr>
+          <w:rFonts w:ascii="Consolas" w:hAnsi="Consolas"/>
+          <w:color w:val="02664D"/>
+          <w:sz w:val="21"/>
+        </w:rPr>
+        <w:t>npm install</w:t>
+      </w:r>
+    </w:p>
+    <w:p>
+      <w:pPr>
+        <w:ind w:left="432"/>
+      </w:pPr>
+      <w:r>
+        <w:rPr>
+          <w:rFonts w:ascii="Consolas" w:hAnsi="Consolas"/>
+          <w:color w:val="02664D"/>
+          <w:sz w:val="21"/>
+        </w:rPr>
+        <w:t>npm run dev</w:t>
+      </w:r>
+    </w:p>
+    <w:p>
+      <w:pPr>
+        <w:pStyle w:val="ListNumber"/>
+      </w:pPr>
+      <w:r>
+        <w:t>A link will appear in the terminal (or a "Open in Browser" popup in a Codespace). Open it.</w:t>
+      </w:r>
+    </w:p>
+    <w:p>
+      <w:pPr>
+        <w:pStyle w:val="ListNumber"/>
+      </w:pPr>
+      <w:r>
+        <w:t>You should see a training page with three products already showing: an image, a live rainfall reading, and a live sea level reading. Leave npm run dev running for the rest of this practical - the page updates itself whenever you save a file.</w:t>
+      </w:r>
+    </w:p>
+    <w:p>
+      <w:r>
+        <w:t>______________________________________________________________________</w:t>
+      </w:r>
+    </w:p>
+    <w:p>
+      <w:r>
+        <w:rPr>
+          <w:b/>
+          <w:color w:val="02C39A"/>
+          <w:sz w:val="30"/>
+        </w:rPr>
+        <w:t>Part B — Choose Your Product  (5 min)</w:t>
+      </w:r>
+    </w:p>
+    <w:p>
+      <w:r>
+        <w:rPr>
+          <w:b w:val="0"/>
+          <w:i w:val="0"/>
+          <w:sz w:val="22"/>
+        </w:rPr>
+        <w:t>Decide which ONE of the three you want to keep on your page:</w:t>
       </w:r>
     </w:p>
     <w:p>
@@ -125,7 +192,15 @@
         <w:pStyle w:val="ListBullet"/>
       </w:pPr>
       <w:r>
-        <w:t>A live reading (e.g. today’s rainfall, or live sea level from a real Pacific tide gauge)</w:t>
+        <w:t>A live rainfall reading</w:t>
+      </w:r>
+    </w:p>
+    <w:p>
+      <w:pPr>
+        <w:pStyle w:val="ListBullet"/>
+      </w:pPr>
+      <w:r>
+        <w:t>A live sea level reading from a real Pacific tide gauge</w:t>
       </w:r>
     </w:p>
     <w:p>
@@ -140,7 +215,7 @@
           <w:color w:val="02C39A"/>
           <w:sz w:val="30"/>
         </w:rPr>
-        <w:t>Part B — Look at the Examples  (10 min)</w:t>
+        <w:t>Part C — Keep One, Edit It  (15 min)</w:t>
       </w:r>
     </w:p>
     <w:p>
@@ -148,7 +223,7 @@
         <w:pStyle w:val="ListNumber"/>
       </w:pPr>
       <w:r>
-        <w:t>Open embed_examples.html in a web browser - all three options are live on the page.</w:t>
+        <w:t>Open src/App.jsx in a text editor.</w:t>
       </w:r>
     </w:p>
     <w:p>
@@ -156,7 +231,7 @@
         <w:pStyle w:val="ListNumber"/>
       </w:pPr>
       <w:r>
-        <w:t>Open the same file in a text editor and find the block that starts with function Product() { for the option you liked.</w:t>
+        <w:t>You’ll see three lines near the bottom: one for each product. Delete the two lines for the products you don’t want, keeping only the one you chose.</w:t>
       </w:r>
     </w:p>
     <w:p>
@@ -164,22 +239,7 @@
         <w:pStyle w:val="ListNumber"/>
       </w:pPr>
       <w:r>
-        <w:t>Pick the one closest to what you chose in Part A.</w:t>
-      </w:r>
-    </w:p>
-    <w:p>
-      <w:r>
-        <w:t>______________________________________________________________________</w:t>
-      </w:r>
-    </w:p>
-    <w:p>
-      <w:r>
-        <w:rPr>
-          <w:b/>
-          <w:color w:val="02C39A"/>
-          <w:sz w:val="30"/>
-        </w:rPr>
-        <w:t>Part C — Add It to Your Page  (10 min)</w:t>
+        <w:t>Save the file and check the browser - the other two products should disappear automatically.</w:t>
       </w:r>
     </w:p>
     <w:p>
@@ -187,7 +247,7 @@
         <w:pStyle w:val="ListNumber"/>
       </w:pPr>
       <w:r>
-        <w:t>Open training_page_template.html in a text editor.</w:t>
+        <w:t>Now open src/examples.jsx. Find the matching block for the product you kept, and edit it for your own country: change the image link, or the station ID (see Practical 7’s notes for real Pacific station IDs), or the label text.</w:t>
       </w:r>
     </w:p>
     <w:p>
@@ -195,31 +255,7 @@
         <w:pStyle w:val="ListNumber"/>
       </w:pPr>
       <w:r>
-        <w:t>Find the comment that says ADD YOUR EMBED CODE HERE.</w:t>
-      </w:r>
-    </w:p>
-    <w:p>
-      <w:pPr>
-        <w:pStyle w:val="ListNumber"/>
-      </w:pPr>
-      <w:r>
-        <w:t>Copy your chosen function Product() {...} block from embed_examples.html and paste it into that spot.</w:t>
-      </w:r>
-    </w:p>
-    <w:p>
-      <w:pPr>
-        <w:pStyle w:val="ListNumber"/>
-      </w:pPr>
-      <w:r>
-        <w:t>Edit the source link, label or station ID so it reflects your own country where possible.</w:t>
-      </w:r>
-    </w:p>
-    <w:p>
-      <w:pPr>
-        <w:pStyle w:val="ListNumber"/>
-      </w:pPr>
-      <w:r>
-        <w:t>Save the file.</w:t>
+        <w:t>Save the file and check the browser again - your change should appear within a second or two, with no manual refresh needed.</w:t>
       </w:r>
     </w:p>
     <w:p>
@@ -242,7 +278,7 @@
         <w:pStyle w:val="ListNumber"/>
       </w:pPr>
       <w:r>
-        <w:t>Open training_page_template.html in your browser (double-click the file, or drag it into a browser window) to see your change.</w:t>
+        <w:t>With the page still open, resize the browser window to be narrow, like a phone screen - or use your browser’s device toolbar (F12, then the phone/tablet icon) - and check the embed still looks good.</w:t>
       </w:r>
     </w:p>
     <w:p>
@@ -250,15 +286,7 @@
         <w:pStyle w:val="ListNumber"/>
       </w:pPr>
       <w:r>
-        <w:t>Resize the browser window to be narrow, like a phone screen - or use your browser’s device toolbar (F12, then the phone/tablet icon) - and check the embed still looks good.</w:t>
-      </w:r>
-    </w:p>
-    <w:p>
-      <w:pPr>
-        <w:pStyle w:val="ListNumber"/>
-      </w:pPr>
-      <w:r>
-        <w:t>Add a short caption and today’s date near your embed, so visitors know what they’re looking at and how current it is.</w:t>
+        <w:t>Edit the "Last updated" line near the bottom of src/App.jsx to today’s date and save.</w:t>
       </w:r>
     </w:p>
     <w:p>

</xml_diff>